<commit_message>
update README.md for Modul 347 with virtualization comparison table
</commit_message>
<xml_diff>
--- a/Modul 347/Unterlagen/10.4_CV_Versus_VM.docx
+++ b/Modul 347/Unterlagen/10.4_CV_Versus_VM.docx
@@ -1,6 +1,6 @@
 
 <file path=word/document.xml><?xml version="1.0" encoding="utf-8"?>
-<w:document xmlns:wpc="http://schemas.microsoft.com/office/word/2010/wordprocessingCanvas" xmlns:cx="http://schemas.microsoft.com/office/drawing/2014/chartex" xmlns:cx1="http://schemas.microsoft.com/office/drawing/2015/9/8/chartex" xmlns:cx2="http://schemas.microsoft.com/office/drawing/2015/10/21/chartex" xmlns:cx3="http://schemas.microsoft.com/office/drawing/2016/5/9/chartex" xmlns:cx4="http://schemas.microsoft.com/office/drawing/2016/5/10/chartex" xmlns:cx5="http://schemas.microsoft.com/office/drawing/2016/5/11/chartex" xmlns:cx6="http://schemas.microsoft.com/office/drawing/2016/5/12/chartex" xmlns:cx7="http://schemas.microsoft.com/office/drawing/2016/5/13/chartex" xmlns:cx8="http://schemas.microsoft.com/office/drawing/2016/5/14/chartex" xmlns:mc="http://schemas.openxmlformats.org/markup-compatibility/2006" xmlns:aink="http://schemas.microsoft.com/office/drawing/2016/ink" xmlns:am3d="http://schemas.microsoft.com/office/drawing/2017/model3d" xmlns:o="urn:schemas-microsoft-com:office:office" xmlns:r="http://schemas.openxmlformats.org/officeDocument/2006/relationships" xmlns:m="http://schemas.openxmlformats.org/officeDocument/2006/math" xmlns:v="urn:schemas-microsoft-com:vml" xmlns:wp14="http://schemas.microsoft.com/office/word/2010/wordprocessingDrawing" xmlns:wp="http://schemas.openxmlformats.org/drawingml/2006/wordprocessingDrawing" xmlns:w10="urn:schemas-microsoft-com:office:word" xmlns:w="http://schemas.openxmlformats.org/wordprocessingml/2006/main" xmlns:w14="http://schemas.microsoft.com/office/word/2010/wordml" xmlns:w15="http://schemas.microsoft.com/office/word/2012/wordml" xmlns:w16cid="http://schemas.microsoft.com/office/word/2016/wordml/cid" xmlns:w16se="http://schemas.microsoft.com/office/word/2015/wordml/symex" xmlns:wpg="http://schemas.microsoft.com/office/word/2010/wordprocessingGroup" xmlns:wpi="http://schemas.microsoft.com/office/word/2010/wordprocessingInk" xmlns:wne="http://schemas.microsoft.com/office/word/2006/wordml" xmlns:wps="http://schemas.microsoft.com/office/word/2010/wordprocessingShape" mc:Ignorable="w14 w15 w16se w16cid wp14">
+<w:document xmlns:wpc="http://schemas.microsoft.com/office/word/2010/wordprocessingCanvas" xmlns:cx="http://schemas.microsoft.com/office/drawing/2014/chartex" xmlns:cx1="http://schemas.microsoft.com/office/drawing/2015/9/8/chartex" xmlns:cx2="http://schemas.microsoft.com/office/drawing/2015/10/21/chartex" xmlns:cx3="http://schemas.microsoft.com/office/drawing/2016/5/9/chartex" xmlns:cx4="http://schemas.microsoft.com/office/drawing/2016/5/10/chartex" xmlns:cx5="http://schemas.microsoft.com/office/drawing/2016/5/11/chartex" xmlns:cx6="http://schemas.microsoft.com/office/drawing/2016/5/12/chartex" xmlns:cx7="http://schemas.microsoft.com/office/drawing/2016/5/13/chartex" xmlns:cx8="http://schemas.microsoft.com/office/drawing/2016/5/14/chartex" xmlns:mc="http://schemas.openxmlformats.org/markup-compatibility/2006" xmlns:aink="http://schemas.microsoft.com/office/drawing/2016/ink" xmlns:am3d="http://schemas.microsoft.com/office/drawing/2017/model3d" xmlns:o="urn:schemas-microsoft-com:office:office" xmlns:oel="http://schemas.microsoft.com/office/2019/extlst" xmlns:r="http://schemas.openxmlformats.org/officeDocument/2006/relationships" xmlns:m="http://schemas.openxmlformats.org/officeDocument/2006/math" xmlns:v="urn:schemas-microsoft-com:vml" xmlns:wp14="http://schemas.microsoft.com/office/word/2010/wordprocessingDrawing" xmlns:wp="http://schemas.openxmlformats.org/drawingml/2006/wordprocessingDrawing" xmlns:w10="urn:schemas-microsoft-com:office:word" xmlns:w="http://schemas.openxmlformats.org/wordprocessingml/2006/main" xmlns:w14="http://schemas.microsoft.com/office/word/2010/wordml" xmlns:w15="http://schemas.microsoft.com/office/word/2012/wordml" xmlns:w16cex="http://schemas.microsoft.com/office/word/2018/wordml/cex" xmlns:w16cid="http://schemas.microsoft.com/office/word/2016/wordml/cid" xmlns:w16="http://schemas.microsoft.com/office/word/2018/wordml" xmlns:w16du="http://schemas.microsoft.com/office/word/2023/wordml/word16du" xmlns:w16sdtdh="http://schemas.microsoft.com/office/word/2020/wordml/sdtdatahash" xmlns:w16se="http://schemas.microsoft.com/office/word/2015/wordml/symex" xmlns:wpg="http://schemas.microsoft.com/office/word/2010/wordprocessingGroup" xmlns:wpi="http://schemas.microsoft.com/office/word/2010/wordprocessingInk" xmlns:wne="http://schemas.microsoft.com/office/word/2006/wordml" xmlns:wps="http://schemas.microsoft.com/office/word/2010/wordprocessingShape" mc:Ignorable="w14 w15 w16se w16cid w16 w16cex w16sdtdh w16du wp14">
   <w:body>
     <w:p>
       <w:pPr>
@@ -463,13 +463,11 @@
           <w:bCs/>
         </w:rPr>
       </w:pPr>
-      <w:bookmarkStart w:id="3" w:name="_GoBack"/>
-      <w:bookmarkEnd w:id="3"/>
     </w:p>
     <w:sectPr>
-      <w:headerReference w:type="even" r:id="rId10"/>
-      <w:headerReference w:type="default" r:id="rId11"/>
-      <w:footerReference w:type="default" r:id="rId12"/>
+      <w:headerReference w:type="even" r:id="rId11"/>
+      <w:headerReference w:type="default" r:id="rId12"/>
+      <w:footerReference w:type="default" r:id="rId13"/>
       <w:pgSz w:w="16838" w:h="11906" w:orient="landscape" w:code="9"/>
       <w:pgMar w:top="1418" w:right="1560" w:bottom="851" w:left="1134" w:header="709" w:footer="465" w:gutter="0"/>
       <w:pgNumType w:start="1"/>
@@ -481,7 +479,7 @@
 </file>
 
 <file path=word/endnotes.xml><?xml version="1.0" encoding="utf-8"?>
-<w:endnotes xmlns:wpc="http://schemas.microsoft.com/office/word/2010/wordprocessingCanvas" xmlns:cx="http://schemas.microsoft.com/office/drawing/2014/chartex" xmlns:cx1="http://schemas.microsoft.com/office/drawing/2015/9/8/chartex" xmlns:cx2="http://schemas.microsoft.com/office/drawing/2015/10/21/chartex" xmlns:cx3="http://schemas.microsoft.com/office/drawing/2016/5/9/chartex" xmlns:cx4="http://schemas.microsoft.com/office/drawing/2016/5/10/chartex" xmlns:cx5="http://schemas.microsoft.com/office/drawing/2016/5/11/chartex" xmlns:cx6="http://schemas.microsoft.com/office/drawing/2016/5/12/chartex" xmlns:cx7="http://schemas.microsoft.com/office/drawing/2016/5/13/chartex" xmlns:cx8="http://schemas.microsoft.com/office/drawing/2016/5/14/chartex" xmlns:mc="http://schemas.openxmlformats.org/markup-compatibility/2006" xmlns:aink="http://schemas.microsoft.com/office/drawing/2016/ink" xmlns:am3d="http://schemas.microsoft.com/office/drawing/2017/model3d" xmlns:o="urn:schemas-microsoft-com:office:office" xmlns:r="http://schemas.openxmlformats.org/officeDocument/2006/relationships" xmlns:m="http://schemas.openxmlformats.org/officeDocument/2006/math" xmlns:v="urn:schemas-microsoft-com:vml" xmlns:wp14="http://schemas.microsoft.com/office/word/2010/wordprocessingDrawing" xmlns:wp="http://schemas.openxmlformats.org/drawingml/2006/wordprocessingDrawing" xmlns:w10="urn:schemas-microsoft-com:office:word" xmlns:w="http://schemas.openxmlformats.org/wordprocessingml/2006/main" xmlns:w14="http://schemas.microsoft.com/office/word/2010/wordml" xmlns:w15="http://schemas.microsoft.com/office/word/2012/wordml" xmlns:w16cid="http://schemas.microsoft.com/office/word/2016/wordml/cid" xmlns:w16se="http://schemas.microsoft.com/office/word/2015/wordml/symex" xmlns:wpg="http://schemas.microsoft.com/office/word/2010/wordprocessingGroup" xmlns:wpi="http://schemas.microsoft.com/office/word/2010/wordprocessingInk" xmlns:wne="http://schemas.microsoft.com/office/word/2006/wordml" xmlns:wps="http://schemas.microsoft.com/office/word/2010/wordprocessingShape" mc:Ignorable="w14 w15 w16se w16cid wp14">
+<w:endnotes xmlns:wpc="http://schemas.microsoft.com/office/word/2010/wordprocessingCanvas" xmlns:cx="http://schemas.microsoft.com/office/drawing/2014/chartex" xmlns:cx1="http://schemas.microsoft.com/office/drawing/2015/9/8/chartex" xmlns:cx2="http://schemas.microsoft.com/office/drawing/2015/10/21/chartex" xmlns:cx3="http://schemas.microsoft.com/office/drawing/2016/5/9/chartex" xmlns:cx4="http://schemas.microsoft.com/office/drawing/2016/5/10/chartex" xmlns:cx5="http://schemas.microsoft.com/office/drawing/2016/5/11/chartex" xmlns:cx6="http://schemas.microsoft.com/office/drawing/2016/5/12/chartex" xmlns:cx7="http://schemas.microsoft.com/office/drawing/2016/5/13/chartex" xmlns:cx8="http://schemas.microsoft.com/office/drawing/2016/5/14/chartex" xmlns:mc="http://schemas.openxmlformats.org/markup-compatibility/2006" xmlns:aink="http://schemas.microsoft.com/office/drawing/2016/ink" xmlns:am3d="http://schemas.microsoft.com/office/drawing/2017/model3d" xmlns:o="urn:schemas-microsoft-com:office:office" xmlns:oel="http://schemas.microsoft.com/office/2019/extlst" xmlns:r="http://schemas.openxmlformats.org/officeDocument/2006/relationships" xmlns:m="http://schemas.openxmlformats.org/officeDocument/2006/math" xmlns:v="urn:schemas-microsoft-com:vml" xmlns:wp14="http://schemas.microsoft.com/office/word/2010/wordprocessingDrawing" xmlns:wp="http://schemas.openxmlformats.org/drawingml/2006/wordprocessingDrawing" xmlns:w10="urn:schemas-microsoft-com:office:word" xmlns:w="http://schemas.openxmlformats.org/wordprocessingml/2006/main" xmlns:w14="http://schemas.microsoft.com/office/word/2010/wordml" xmlns:w15="http://schemas.microsoft.com/office/word/2012/wordml" xmlns:w16cex="http://schemas.microsoft.com/office/word/2018/wordml/cex" xmlns:w16cid="http://schemas.microsoft.com/office/word/2016/wordml/cid" xmlns:w16="http://schemas.microsoft.com/office/word/2018/wordml" xmlns:w16du="http://schemas.microsoft.com/office/word/2023/wordml/word16du" xmlns:w16sdtdh="http://schemas.microsoft.com/office/word/2020/wordml/sdtdatahash" xmlns:w16se="http://schemas.microsoft.com/office/word/2015/wordml/symex" xmlns:wpg="http://schemas.microsoft.com/office/word/2010/wordprocessingGroup" xmlns:wpi="http://schemas.microsoft.com/office/word/2010/wordprocessingInk" xmlns:wne="http://schemas.microsoft.com/office/word/2006/wordml" xmlns:wps="http://schemas.microsoft.com/office/word/2010/wordprocessingShape" mc:Ignorable="w14 w15 w16se w16cid w16 w16cex w16sdtdh w16du wp14">
   <w:endnote w:type="separator" w:id="-1">
     <w:p>
       <w:r>
@@ -507,7 +505,7 @@
 </file>
 
 <file path=word/footer1.xml><?xml version="1.0" encoding="utf-8"?>
-<w:ftr xmlns:wpc="http://schemas.microsoft.com/office/word/2010/wordprocessingCanvas" xmlns:cx="http://schemas.microsoft.com/office/drawing/2014/chartex" xmlns:cx1="http://schemas.microsoft.com/office/drawing/2015/9/8/chartex" xmlns:cx2="http://schemas.microsoft.com/office/drawing/2015/10/21/chartex" xmlns:cx3="http://schemas.microsoft.com/office/drawing/2016/5/9/chartex" xmlns:cx4="http://schemas.microsoft.com/office/drawing/2016/5/10/chartex" xmlns:cx5="http://schemas.microsoft.com/office/drawing/2016/5/11/chartex" xmlns:cx6="http://schemas.microsoft.com/office/drawing/2016/5/12/chartex" xmlns:cx7="http://schemas.microsoft.com/office/drawing/2016/5/13/chartex" xmlns:cx8="http://schemas.microsoft.com/office/drawing/2016/5/14/chartex" xmlns:mc="http://schemas.openxmlformats.org/markup-compatibility/2006" xmlns:aink="http://schemas.microsoft.com/office/drawing/2016/ink" xmlns:am3d="http://schemas.microsoft.com/office/drawing/2017/model3d" xmlns:o="urn:schemas-microsoft-com:office:office" xmlns:r="http://schemas.openxmlformats.org/officeDocument/2006/relationships" xmlns:m="http://schemas.openxmlformats.org/officeDocument/2006/math" xmlns:v="urn:schemas-microsoft-com:vml" xmlns:wp14="http://schemas.microsoft.com/office/word/2010/wordprocessingDrawing" xmlns:wp="http://schemas.openxmlformats.org/drawingml/2006/wordprocessingDrawing" xmlns:w10="urn:schemas-microsoft-com:office:word" xmlns:w="http://schemas.openxmlformats.org/wordprocessingml/2006/main" xmlns:w14="http://schemas.microsoft.com/office/word/2010/wordml" xmlns:w15="http://schemas.microsoft.com/office/word/2012/wordml" xmlns:w16cid="http://schemas.microsoft.com/office/word/2016/wordml/cid" xmlns:w16se="http://schemas.microsoft.com/office/word/2015/wordml/symex" xmlns:wpg="http://schemas.microsoft.com/office/word/2010/wordprocessingGroup" xmlns:wpi="http://schemas.microsoft.com/office/word/2010/wordprocessingInk" xmlns:wne="http://schemas.microsoft.com/office/word/2006/wordml" xmlns:wps="http://schemas.microsoft.com/office/word/2010/wordprocessingShape" mc:Ignorable="w14 w15 w16se w16cid wp14">
+<w:ftr xmlns:wpc="http://schemas.microsoft.com/office/word/2010/wordprocessingCanvas" xmlns:cx="http://schemas.microsoft.com/office/drawing/2014/chartex" xmlns:cx1="http://schemas.microsoft.com/office/drawing/2015/9/8/chartex" xmlns:cx2="http://schemas.microsoft.com/office/drawing/2015/10/21/chartex" xmlns:cx3="http://schemas.microsoft.com/office/drawing/2016/5/9/chartex" xmlns:cx4="http://schemas.microsoft.com/office/drawing/2016/5/10/chartex" xmlns:cx5="http://schemas.microsoft.com/office/drawing/2016/5/11/chartex" xmlns:cx6="http://schemas.microsoft.com/office/drawing/2016/5/12/chartex" xmlns:cx7="http://schemas.microsoft.com/office/drawing/2016/5/13/chartex" xmlns:cx8="http://schemas.microsoft.com/office/drawing/2016/5/14/chartex" xmlns:mc="http://schemas.openxmlformats.org/markup-compatibility/2006" xmlns:aink="http://schemas.microsoft.com/office/drawing/2016/ink" xmlns:am3d="http://schemas.microsoft.com/office/drawing/2017/model3d" xmlns:o="urn:schemas-microsoft-com:office:office" xmlns:oel="http://schemas.microsoft.com/office/2019/extlst" xmlns:r="http://schemas.openxmlformats.org/officeDocument/2006/relationships" xmlns:m="http://schemas.openxmlformats.org/officeDocument/2006/math" xmlns:v="urn:schemas-microsoft-com:vml" xmlns:wp14="http://schemas.microsoft.com/office/word/2010/wordprocessingDrawing" xmlns:wp="http://schemas.openxmlformats.org/drawingml/2006/wordprocessingDrawing" xmlns:w10="urn:schemas-microsoft-com:office:word" xmlns:w="http://schemas.openxmlformats.org/wordprocessingml/2006/main" xmlns:w14="http://schemas.microsoft.com/office/word/2010/wordml" xmlns:w15="http://schemas.microsoft.com/office/word/2012/wordml" xmlns:w16cex="http://schemas.microsoft.com/office/word/2018/wordml/cex" xmlns:w16cid="http://schemas.microsoft.com/office/word/2016/wordml/cid" xmlns:w16="http://schemas.microsoft.com/office/word/2018/wordml" xmlns:w16du="http://schemas.microsoft.com/office/word/2023/wordml/word16du" xmlns:w16sdtdh="http://schemas.microsoft.com/office/word/2020/wordml/sdtdatahash" xmlns:w16se="http://schemas.microsoft.com/office/word/2015/wordml/symex" xmlns:wpg="http://schemas.microsoft.com/office/word/2010/wordprocessingGroup" xmlns:wpi="http://schemas.microsoft.com/office/word/2010/wordprocessingInk" xmlns:wne="http://schemas.microsoft.com/office/word/2006/wordml" xmlns:wps="http://schemas.microsoft.com/office/word/2010/wordprocessingShape" mc:Ignorable="w14 w15 w16se w16cid w16 w16cex w16sdtdh w16du wp14">
   <w:p>
     <w:pPr>
       <w:pStyle w:val="Fuzeile"/>
@@ -620,7 +618,7 @@
             </wp:anchor>
           </w:drawing>
         </mc:Choice>
-        <mc:Fallback xmlns:w16sdtdh="http://schemas.microsoft.com/office/word/2020/wordml/sdtdatahash" xmlns:w16="http://schemas.microsoft.com/office/word/2018/wordml" xmlns:w16cex="http://schemas.microsoft.com/office/word/2018/wordml/cex" xmlns:oel="http://schemas.microsoft.com/office/2019/extlst">
+        <mc:Fallback>
           <w:pict>
             <v:shapetype w14:anchorId="15F24F69" id="_x0000_t202" coordsize="21600,21600" o:spt="202" path="m,l,21600r21600,l21600,xe">
               <v:stroke joinstyle="miter"/>
@@ -751,7 +749,7 @@
       <w:rPr>
         <w:noProof/>
       </w:rPr>
-      <w:t>28.01.2023</w:t>
+      <w:t>02.02.2023</w:t>
     </w:r>
     <w:r>
       <w:rPr>
@@ -782,7 +780,7 @@
 </file>
 
 <file path=word/footnotes.xml><?xml version="1.0" encoding="utf-8"?>
-<w:footnotes xmlns:wpc="http://schemas.microsoft.com/office/word/2010/wordprocessingCanvas" xmlns:cx="http://schemas.microsoft.com/office/drawing/2014/chartex" xmlns:cx1="http://schemas.microsoft.com/office/drawing/2015/9/8/chartex" xmlns:cx2="http://schemas.microsoft.com/office/drawing/2015/10/21/chartex" xmlns:cx3="http://schemas.microsoft.com/office/drawing/2016/5/9/chartex" xmlns:cx4="http://schemas.microsoft.com/office/drawing/2016/5/10/chartex" xmlns:cx5="http://schemas.microsoft.com/office/drawing/2016/5/11/chartex" xmlns:cx6="http://schemas.microsoft.com/office/drawing/2016/5/12/chartex" xmlns:cx7="http://schemas.microsoft.com/office/drawing/2016/5/13/chartex" xmlns:cx8="http://schemas.microsoft.com/office/drawing/2016/5/14/chartex" xmlns:mc="http://schemas.openxmlformats.org/markup-compatibility/2006" xmlns:aink="http://schemas.microsoft.com/office/drawing/2016/ink" xmlns:am3d="http://schemas.microsoft.com/office/drawing/2017/model3d" xmlns:o="urn:schemas-microsoft-com:office:office" xmlns:r="http://schemas.openxmlformats.org/officeDocument/2006/relationships" xmlns:m="http://schemas.openxmlformats.org/officeDocument/2006/math" xmlns:v="urn:schemas-microsoft-com:vml" xmlns:wp14="http://schemas.microsoft.com/office/word/2010/wordprocessingDrawing" xmlns:wp="http://schemas.openxmlformats.org/drawingml/2006/wordprocessingDrawing" xmlns:w10="urn:schemas-microsoft-com:office:word" xmlns:w="http://schemas.openxmlformats.org/wordprocessingml/2006/main" xmlns:w14="http://schemas.microsoft.com/office/word/2010/wordml" xmlns:w15="http://schemas.microsoft.com/office/word/2012/wordml" xmlns:w16cid="http://schemas.microsoft.com/office/word/2016/wordml/cid" xmlns:w16se="http://schemas.microsoft.com/office/word/2015/wordml/symex" xmlns:wpg="http://schemas.microsoft.com/office/word/2010/wordprocessingGroup" xmlns:wpi="http://schemas.microsoft.com/office/word/2010/wordprocessingInk" xmlns:wne="http://schemas.microsoft.com/office/word/2006/wordml" xmlns:wps="http://schemas.microsoft.com/office/word/2010/wordprocessingShape" mc:Ignorable="w14 w15 w16se w16cid wp14">
+<w:footnotes xmlns:wpc="http://schemas.microsoft.com/office/word/2010/wordprocessingCanvas" xmlns:cx="http://schemas.microsoft.com/office/drawing/2014/chartex" xmlns:cx1="http://schemas.microsoft.com/office/drawing/2015/9/8/chartex" xmlns:cx2="http://schemas.microsoft.com/office/drawing/2015/10/21/chartex" xmlns:cx3="http://schemas.microsoft.com/office/drawing/2016/5/9/chartex" xmlns:cx4="http://schemas.microsoft.com/office/drawing/2016/5/10/chartex" xmlns:cx5="http://schemas.microsoft.com/office/drawing/2016/5/11/chartex" xmlns:cx6="http://schemas.microsoft.com/office/drawing/2016/5/12/chartex" xmlns:cx7="http://schemas.microsoft.com/office/drawing/2016/5/13/chartex" xmlns:cx8="http://schemas.microsoft.com/office/drawing/2016/5/14/chartex" xmlns:mc="http://schemas.openxmlformats.org/markup-compatibility/2006" xmlns:aink="http://schemas.microsoft.com/office/drawing/2016/ink" xmlns:am3d="http://schemas.microsoft.com/office/drawing/2017/model3d" xmlns:o="urn:schemas-microsoft-com:office:office" xmlns:oel="http://schemas.microsoft.com/office/2019/extlst" xmlns:r="http://schemas.openxmlformats.org/officeDocument/2006/relationships" xmlns:m="http://schemas.openxmlformats.org/officeDocument/2006/math" xmlns:v="urn:schemas-microsoft-com:vml" xmlns:wp14="http://schemas.microsoft.com/office/word/2010/wordprocessingDrawing" xmlns:wp="http://schemas.openxmlformats.org/drawingml/2006/wordprocessingDrawing" xmlns:w10="urn:schemas-microsoft-com:office:word" xmlns:w="http://schemas.openxmlformats.org/wordprocessingml/2006/main" xmlns:w14="http://schemas.microsoft.com/office/word/2010/wordml" xmlns:w15="http://schemas.microsoft.com/office/word/2012/wordml" xmlns:w16cex="http://schemas.microsoft.com/office/word/2018/wordml/cex" xmlns:w16cid="http://schemas.microsoft.com/office/word/2016/wordml/cid" xmlns:w16="http://schemas.microsoft.com/office/word/2018/wordml" xmlns:w16du="http://schemas.microsoft.com/office/word/2023/wordml/word16du" xmlns:w16sdtdh="http://schemas.microsoft.com/office/word/2020/wordml/sdtdatahash" xmlns:w16se="http://schemas.microsoft.com/office/word/2015/wordml/symex" xmlns:wpg="http://schemas.microsoft.com/office/word/2010/wordprocessingGroup" xmlns:wpi="http://schemas.microsoft.com/office/word/2010/wordprocessingInk" xmlns:wne="http://schemas.microsoft.com/office/word/2006/wordml" xmlns:wps="http://schemas.microsoft.com/office/word/2010/wordprocessingShape" mc:Ignorable="w14 w15 w16se w16cid w16 w16cex w16sdtdh w16du wp14">
   <w:footnote w:type="separator" w:id="-1">
     <w:p>
       <w:r>
@@ -808,7 +806,7 @@
 </file>
 
 <file path=word/header1.xml><?xml version="1.0" encoding="utf-8"?>
-<w:hdr xmlns:wpc="http://schemas.microsoft.com/office/word/2010/wordprocessingCanvas" xmlns:cx="http://schemas.microsoft.com/office/drawing/2014/chartex" xmlns:cx1="http://schemas.microsoft.com/office/drawing/2015/9/8/chartex" xmlns:cx2="http://schemas.microsoft.com/office/drawing/2015/10/21/chartex" xmlns:cx3="http://schemas.microsoft.com/office/drawing/2016/5/9/chartex" xmlns:cx4="http://schemas.microsoft.com/office/drawing/2016/5/10/chartex" xmlns:cx5="http://schemas.microsoft.com/office/drawing/2016/5/11/chartex" xmlns:cx6="http://schemas.microsoft.com/office/drawing/2016/5/12/chartex" xmlns:cx7="http://schemas.microsoft.com/office/drawing/2016/5/13/chartex" xmlns:cx8="http://schemas.microsoft.com/office/drawing/2016/5/14/chartex" xmlns:mc="http://schemas.openxmlformats.org/markup-compatibility/2006" xmlns:aink="http://schemas.microsoft.com/office/drawing/2016/ink" xmlns:am3d="http://schemas.microsoft.com/office/drawing/2017/model3d" xmlns:o="urn:schemas-microsoft-com:office:office" xmlns:r="http://schemas.openxmlformats.org/officeDocument/2006/relationships" xmlns:m="http://schemas.openxmlformats.org/officeDocument/2006/math" xmlns:v="urn:schemas-microsoft-com:vml" xmlns:wp14="http://schemas.microsoft.com/office/word/2010/wordprocessingDrawing" xmlns:wp="http://schemas.openxmlformats.org/drawingml/2006/wordprocessingDrawing" xmlns:w10="urn:schemas-microsoft-com:office:word" xmlns:w="http://schemas.openxmlformats.org/wordprocessingml/2006/main" xmlns:w14="http://schemas.microsoft.com/office/word/2010/wordml" xmlns:w15="http://schemas.microsoft.com/office/word/2012/wordml" xmlns:w16cid="http://schemas.microsoft.com/office/word/2016/wordml/cid" xmlns:w16se="http://schemas.microsoft.com/office/word/2015/wordml/symex" xmlns:wpg="http://schemas.microsoft.com/office/word/2010/wordprocessingGroup" xmlns:wpi="http://schemas.microsoft.com/office/word/2010/wordprocessingInk" xmlns:wne="http://schemas.microsoft.com/office/word/2006/wordml" xmlns:wps="http://schemas.microsoft.com/office/word/2010/wordprocessingShape" mc:Ignorable="w14 w15 w16se w16cid wp14">
+<w:hdr xmlns:wpc="http://schemas.microsoft.com/office/word/2010/wordprocessingCanvas" xmlns:cx="http://schemas.microsoft.com/office/drawing/2014/chartex" xmlns:cx1="http://schemas.microsoft.com/office/drawing/2015/9/8/chartex" xmlns:cx2="http://schemas.microsoft.com/office/drawing/2015/10/21/chartex" xmlns:cx3="http://schemas.microsoft.com/office/drawing/2016/5/9/chartex" xmlns:cx4="http://schemas.microsoft.com/office/drawing/2016/5/10/chartex" xmlns:cx5="http://schemas.microsoft.com/office/drawing/2016/5/11/chartex" xmlns:cx6="http://schemas.microsoft.com/office/drawing/2016/5/12/chartex" xmlns:cx7="http://schemas.microsoft.com/office/drawing/2016/5/13/chartex" xmlns:cx8="http://schemas.microsoft.com/office/drawing/2016/5/14/chartex" xmlns:mc="http://schemas.openxmlformats.org/markup-compatibility/2006" xmlns:aink="http://schemas.microsoft.com/office/drawing/2016/ink" xmlns:am3d="http://schemas.microsoft.com/office/drawing/2017/model3d" xmlns:o="urn:schemas-microsoft-com:office:office" xmlns:oel="http://schemas.microsoft.com/office/2019/extlst" xmlns:r="http://schemas.openxmlformats.org/officeDocument/2006/relationships" xmlns:m="http://schemas.openxmlformats.org/officeDocument/2006/math" xmlns:v="urn:schemas-microsoft-com:vml" xmlns:wp14="http://schemas.microsoft.com/office/word/2010/wordprocessingDrawing" xmlns:wp="http://schemas.openxmlformats.org/drawingml/2006/wordprocessingDrawing" xmlns:w10="urn:schemas-microsoft-com:office:word" xmlns:w="http://schemas.openxmlformats.org/wordprocessingml/2006/main" xmlns:w14="http://schemas.microsoft.com/office/word/2010/wordml" xmlns:w15="http://schemas.microsoft.com/office/word/2012/wordml" xmlns:w16cex="http://schemas.microsoft.com/office/word/2018/wordml/cex" xmlns:w16cid="http://schemas.microsoft.com/office/word/2016/wordml/cid" xmlns:w16="http://schemas.microsoft.com/office/word/2018/wordml" xmlns:w16du="http://schemas.microsoft.com/office/word/2023/wordml/word16du" xmlns:w16sdtdh="http://schemas.microsoft.com/office/word/2020/wordml/sdtdatahash" xmlns:w16se="http://schemas.microsoft.com/office/word/2015/wordml/symex" xmlns:wpg="http://schemas.microsoft.com/office/word/2010/wordprocessingGroup" xmlns:wpi="http://schemas.microsoft.com/office/word/2010/wordprocessingInk" xmlns:wne="http://schemas.microsoft.com/office/word/2006/wordml" xmlns:wps="http://schemas.microsoft.com/office/word/2010/wordprocessingShape" mc:Ignorable="w14 w15 w16se w16cid w16 w16cex w16sdtdh w16du wp14">
   <w:p>
     <w:pPr>
       <w:pStyle w:val="Kopfzeile"/>
@@ -843,7 +841,7 @@
 </file>
 
 <file path=word/header2.xml><?xml version="1.0" encoding="utf-8"?>
-<w:hdr xmlns:wpc="http://schemas.microsoft.com/office/word/2010/wordprocessingCanvas" xmlns:cx="http://schemas.microsoft.com/office/drawing/2014/chartex" xmlns:cx1="http://schemas.microsoft.com/office/drawing/2015/9/8/chartex" xmlns:cx2="http://schemas.microsoft.com/office/drawing/2015/10/21/chartex" xmlns:cx3="http://schemas.microsoft.com/office/drawing/2016/5/9/chartex" xmlns:cx4="http://schemas.microsoft.com/office/drawing/2016/5/10/chartex" xmlns:cx5="http://schemas.microsoft.com/office/drawing/2016/5/11/chartex" xmlns:cx6="http://schemas.microsoft.com/office/drawing/2016/5/12/chartex" xmlns:cx7="http://schemas.microsoft.com/office/drawing/2016/5/13/chartex" xmlns:cx8="http://schemas.microsoft.com/office/drawing/2016/5/14/chartex" xmlns:mc="http://schemas.openxmlformats.org/markup-compatibility/2006" xmlns:aink="http://schemas.microsoft.com/office/drawing/2016/ink" xmlns:am3d="http://schemas.microsoft.com/office/drawing/2017/model3d" xmlns:o="urn:schemas-microsoft-com:office:office" xmlns:r="http://schemas.openxmlformats.org/officeDocument/2006/relationships" xmlns:m="http://schemas.openxmlformats.org/officeDocument/2006/math" xmlns:v="urn:schemas-microsoft-com:vml" xmlns:wp14="http://schemas.microsoft.com/office/word/2010/wordprocessingDrawing" xmlns:wp="http://schemas.openxmlformats.org/drawingml/2006/wordprocessingDrawing" xmlns:w10="urn:schemas-microsoft-com:office:word" xmlns:w="http://schemas.openxmlformats.org/wordprocessingml/2006/main" xmlns:w14="http://schemas.microsoft.com/office/word/2010/wordml" xmlns:w15="http://schemas.microsoft.com/office/word/2012/wordml" xmlns:w16cid="http://schemas.microsoft.com/office/word/2016/wordml/cid" xmlns:w16se="http://schemas.microsoft.com/office/word/2015/wordml/symex" xmlns:wpg="http://schemas.microsoft.com/office/word/2010/wordprocessingGroup" xmlns:wpi="http://schemas.microsoft.com/office/word/2010/wordprocessingInk" xmlns:wne="http://schemas.microsoft.com/office/word/2006/wordml" xmlns:wps="http://schemas.microsoft.com/office/word/2010/wordprocessingShape" mc:Ignorable="w14 w15 w16se w16cid wp14">
+<w:hdr xmlns:wpc="http://schemas.microsoft.com/office/word/2010/wordprocessingCanvas" xmlns:cx="http://schemas.microsoft.com/office/drawing/2014/chartex" xmlns:cx1="http://schemas.microsoft.com/office/drawing/2015/9/8/chartex" xmlns:cx2="http://schemas.microsoft.com/office/drawing/2015/10/21/chartex" xmlns:cx3="http://schemas.microsoft.com/office/drawing/2016/5/9/chartex" xmlns:cx4="http://schemas.microsoft.com/office/drawing/2016/5/10/chartex" xmlns:cx5="http://schemas.microsoft.com/office/drawing/2016/5/11/chartex" xmlns:cx6="http://schemas.microsoft.com/office/drawing/2016/5/12/chartex" xmlns:cx7="http://schemas.microsoft.com/office/drawing/2016/5/13/chartex" xmlns:cx8="http://schemas.microsoft.com/office/drawing/2016/5/14/chartex" xmlns:mc="http://schemas.openxmlformats.org/markup-compatibility/2006" xmlns:aink="http://schemas.microsoft.com/office/drawing/2016/ink" xmlns:am3d="http://schemas.microsoft.com/office/drawing/2017/model3d" xmlns:o="urn:schemas-microsoft-com:office:office" xmlns:oel="http://schemas.microsoft.com/office/2019/extlst" xmlns:r="http://schemas.openxmlformats.org/officeDocument/2006/relationships" xmlns:m="http://schemas.openxmlformats.org/officeDocument/2006/math" xmlns:v="urn:schemas-microsoft-com:vml" xmlns:wp14="http://schemas.microsoft.com/office/word/2010/wordprocessingDrawing" xmlns:wp="http://schemas.openxmlformats.org/drawingml/2006/wordprocessingDrawing" xmlns:w10="urn:schemas-microsoft-com:office:word" xmlns:w="http://schemas.openxmlformats.org/wordprocessingml/2006/main" xmlns:w14="http://schemas.microsoft.com/office/word/2010/wordml" xmlns:w15="http://schemas.microsoft.com/office/word/2012/wordml" xmlns:w16cex="http://schemas.microsoft.com/office/word/2018/wordml/cex" xmlns:w16cid="http://schemas.microsoft.com/office/word/2016/wordml/cid" xmlns:w16="http://schemas.microsoft.com/office/word/2018/wordml" xmlns:w16du="http://schemas.microsoft.com/office/word/2023/wordml/word16du" xmlns:w16sdtdh="http://schemas.microsoft.com/office/word/2020/wordml/sdtdatahash" xmlns:w16se="http://schemas.microsoft.com/office/word/2015/wordml/symex" xmlns:wpg="http://schemas.microsoft.com/office/word/2010/wordprocessingGroup" xmlns:wpi="http://schemas.microsoft.com/office/word/2010/wordprocessingInk" xmlns:wne="http://schemas.microsoft.com/office/word/2006/wordml" xmlns:wps="http://schemas.microsoft.com/office/word/2010/wordprocessingShape" mc:Ignorable="w14 w15 w16se w16cid w16 w16cex w16sdtdh w16du wp14">
   <w:p>
     <w:pPr>
       <w:rPr>
@@ -965,7 +963,7 @@
 </file>
 
 <file path=word/numbering.xml><?xml version="1.0" encoding="utf-8"?>
-<w:numbering xmlns:wpc="http://schemas.microsoft.com/office/word/2010/wordprocessingCanvas" xmlns:cx="http://schemas.microsoft.com/office/drawing/2014/chartex" xmlns:cx1="http://schemas.microsoft.com/office/drawing/2015/9/8/chartex" xmlns:cx2="http://schemas.microsoft.com/office/drawing/2015/10/21/chartex" xmlns:cx3="http://schemas.microsoft.com/office/drawing/2016/5/9/chartex" xmlns:cx4="http://schemas.microsoft.com/office/drawing/2016/5/10/chartex" xmlns:cx5="http://schemas.microsoft.com/office/drawing/2016/5/11/chartex" xmlns:cx6="http://schemas.microsoft.com/office/drawing/2016/5/12/chartex" xmlns:cx7="http://schemas.microsoft.com/office/drawing/2016/5/13/chartex" xmlns:cx8="http://schemas.microsoft.com/office/drawing/2016/5/14/chartex" xmlns:mc="http://schemas.openxmlformats.org/markup-compatibility/2006" xmlns:aink="http://schemas.microsoft.com/office/drawing/2016/ink" xmlns:am3d="http://schemas.microsoft.com/office/drawing/2017/model3d" xmlns:o="urn:schemas-microsoft-com:office:office" xmlns:r="http://schemas.openxmlformats.org/officeDocument/2006/relationships" xmlns:m="http://schemas.openxmlformats.org/officeDocument/2006/math" xmlns:v="urn:schemas-microsoft-com:vml" xmlns:wp14="http://schemas.microsoft.com/office/word/2010/wordprocessingDrawing" xmlns:wp="http://schemas.openxmlformats.org/drawingml/2006/wordprocessingDrawing" xmlns:w10="urn:schemas-microsoft-com:office:word" xmlns:w="http://schemas.openxmlformats.org/wordprocessingml/2006/main" xmlns:w14="http://schemas.microsoft.com/office/word/2010/wordml" xmlns:w15="http://schemas.microsoft.com/office/word/2012/wordml" xmlns:w16cid="http://schemas.microsoft.com/office/word/2016/wordml/cid" xmlns:w16se="http://schemas.microsoft.com/office/word/2015/wordml/symex" xmlns:wpg="http://schemas.microsoft.com/office/word/2010/wordprocessingGroup" xmlns:wpi="http://schemas.microsoft.com/office/word/2010/wordprocessingInk" xmlns:wne="http://schemas.microsoft.com/office/word/2006/wordml" xmlns:wps="http://schemas.microsoft.com/office/word/2010/wordprocessingShape" mc:Ignorable="w14 w15 w16se w16cid wp14">
+<w:numbering xmlns:wpc="http://schemas.microsoft.com/office/word/2010/wordprocessingCanvas" xmlns:cx="http://schemas.microsoft.com/office/drawing/2014/chartex" xmlns:cx1="http://schemas.microsoft.com/office/drawing/2015/9/8/chartex" xmlns:cx2="http://schemas.microsoft.com/office/drawing/2015/10/21/chartex" xmlns:cx3="http://schemas.microsoft.com/office/drawing/2016/5/9/chartex" xmlns:cx4="http://schemas.microsoft.com/office/drawing/2016/5/10/chartex" xmlns:cx5="http://schemas.microsoft.com/office/drawing/2016/5/11/chartex" xmlns:cx6="http://schemas.microsoft.com/office/drawing/2016/5/12/chartex" xmlns:cx7="http://schemas.microsoft.com/office/drawing/2016/5/13/chartex" xmlns:cx8="http://schemas.microsoft.com/office/drawing/2016/5/14/chartex" xmlns:mc="http://schemas.openxmlformats.org/markup-compatibility/2006" xmlns:aink="http://schemas.microsoft.com/office/drawing/2016/ink" xmlns:am3d="http://schemas.microsoft.com/office/drawing/2017/model3d" xmlns:o="urn:schemas-microsoft-com:office:office" xmlns:oel="http://schemas.microsoft.com/office/2019/extlst" xmlns:r="http://schemas.openxmlformats.org/officeDocument/2006/relationships" xmlns:m="http://schemas.openxmlformats.org/officeDocument/2006/math" xmlns:v="urn:schemas-microsoft-com:vml" xmlns:wp14="http://schemas.microsoft.com/office/word/2010/wordprocessingDrawing" xmlns:wp="http://schemas.openxmlformats.org/drawingml/2006/wordprocessingDrawing" xmlns:w10="urn:schemas-microsoft-com:office:word" xmlns:w="http://schemas.openxmlformats.org/wordprocessingml/2006/main" xmlns:w14="http://schemas.microsoft.com/office/word/2010/wordml" xmlns:w15="http://schemas.microsoft.com/office/word/2012/wordml" xmlns:w16cex="http://schemas.microsoft.com/office/word/2018/wordml/cex" xmlns:w16cid="http://schemas.microsoft.com/office/word/2016/wordml/cid" xmlns:w16="http://schemas.microsoft.com/office/word/2018/wordml" xmlns:w16du="http://schemas.microsoft.com/office/word/2023/wordml/word16du" xmlns:w16sdtdh="http://schemas.microsoft.com/office/word/2020/wordml/sdtdatahash" xmlns:w16se="http://schemas.microsoft.com/office/word/2015/wordml/symex" xmlns:wpg="http://schemas.microsoft.com/office/word/2010/wordprocessingGroup" xmlns:wpi="http://schemas.microsoft.com/office/word/2010/wordprocessingInk" xmlns:wne="http://schemas.microsoft.com/office/word/2006/wordml" xmlns:wps="http://schemas.microsoft.com/office/word/2010/wordprocessingShape" mc:Ignorable="w14 w15 w16se w16cid w16 w16cex w16sdtdh w16du wp14">
   <w:abstractNum w:abstractNumId="0" w15:restartNumberingAfterBreak="0">
     <w:nsid w:val="FFFFFF7C"/>
     <w:multiLevelType w:val="singleLevel"/>
@@ -2600,52 +2598,52 @@
       </w:rPr>
     </w:lvl>
   </w:abstractNum>
-  <w:num w:numId="1">
+  <w:num w:numId="1" w16cid:durableId="1197356683">
     <w:abstractNumId w:val="9"/>
   </w:num>
-  <w:num w:numId="2">
+  <w:num w:numId="2" w16cid:durableId="1427655029">
     <w:abstractNumId w:val="11"/>
   </w:num>
-  <w:num w:numId="3">
+  <w:num w:numId="3" w16cid:durableId="944578066">
     <w:abstractNumId w:val="7"/>
   </w:num>
-  <w:num w:numId="4">
+  <w:num w:numId="4" w16cid:durableId="240675059">
     <w:abstractNumId w:val="5"/>
   </w:num>
-  <w:num w:numId="5">
+  <w:num w:numId="5" w16cid:durableId="902645252">
     <w:abstractNumId w:val="4"/>
   </w:num>
-  <w:num w:numId="6">
+  <w:num w:numId="6" w16cid:durableId="1275135251">
     <w:abstractNumId w:val="8"/>
   </w:num>
-  <w:num w:numId="7">
+  <w:num w:numId="7" w16cid:durableId="1913617037">
     <w:abstractNumId w:val="2"/>
   </w:num>
-  <w:num w:numId="8">
+  <w:num w:numId="8" w16cid:durableId="1714962810">
     <w:abstractNumId w:val="12"/>
   </w:num>
-  <w:num w:numId="9">
+  <w:num w:numId="9" w16cid:durableId="1779106105">
     <w:abstractNumId w:val="15"/>
   </w:num>
-  <w:num w:numId="10">
+  <w:num w:numId="10" w16cid:durableId="1238511789">
     <w:abstractNumId w:val="10"/>
   </w:num>
-  <w:num w:numId="11">
+  <w:num w:numId="11" w16cid:durableId="1637636681">
     <w:abstractNumId w:val="14"/>
   </w:num>
-  <w:num w:numId="12">
+  <w:num w:numId="12" w16cid:durableId="1499075196">
     <w:abstractNumId w:val="1"/>
   </w:num>
-  <w:num w:numId="13">
+  <w:num w:numId="13" w16cid:durableId="711922605">
     <w:abstractNumId w:val="0"/>
   </w:num>
-  <w:num w:numId="14">
+  <w:num w:numId="14" w16cid:durableId="1593128221">
     <w:abstractNumId w:val="3"/>
   </w:num>
-  <w:num w:numId="15">
+  <w:num w:numId="15" w16cid:durableId="1397777463">
     <w:abstractNumId w:val="6"/>
   </w:num>
-  <w:num w:numId="16">
+  <w:num w:numId="16" w16cid:durableId="716507674">
     <w:abstractNumId w:val="13"/>
   </w:num>
   <w:numIdMacAtCleanup w:val="7"/>
@@ -2653,7 +2651,7 @@
 </file>
 
 <file path=word/styles.xml><?xml version="1.0" encoding="utf-8"?>
-<w:styles xmlns:mc="http://schemas.openxmlformats.org/markup-compatibility/2006" xmlns:r="http://schemas.openxmlformats.org/officeDocument/2006/relationships" xmlns:w="http://schemas.openxmlformats.org/wordprocessingml/2006/main" xmlns:w14="http://schemas.microsoft.com/office/word/2010/wordml" xmlns:w15="http://schemas.microsoft.com/office/word/2012/wordml" xmlns:w16cid="http://schemas.microsoft.com/office/word/2016/wordml/cid" xmlns:w16se="http://schemas.microsoft.com/office/word/2015/wordml/symex" mc:Ignorable="w14 w15 w16se w16cid">
+<w:styles xmlns:mc="http://schemas.openxmlformats.org/markup-compatibility/2006" xmlns:r="http://schemas.openxmlformats.org/officeDocument/2006/relationships" xmlns:w="http://schemas.openxmlformats.org/wordprocessingml/2006/main" xmlns:w14="http://schemas.microsoft.com/office/word/2010/wordml" xmlns:w15="http://schemas.microsoft.com/office/word/2012/wordml" xmlns:w16cex="http://schemas.microsoft.com/office/word/2018/wordml/cex" xmlns:w16cid="http://schemas.microsoft.com/office/word/2016/wordml/cid" xmlns:w16="http://schemas.microsoft.com/office/word/2018/wordml" xmlns:w16du="http://schemas.microsoft.com/office/word/2023/wordml/word16du" xmlns:w16sdtdh="http://schemas.microsoft.com/office/word/2020/wordml/sdtdatahash" xmlns:w16se="http://schemas.microsoft.com/office/word/2015/wordml/symex" mc:Ignorable="w14 w15 w16se w16cid w16 w16cex w16sdtdh w16du">
   <w:docDefaults>
     <w:rPrDefault>
       <w:rPr>
@@ -2663,7 +2661,7 @@
     </w:rPrDefault>
     <w:pPrDefault/>
   </w:docDefaults>
-  <w:latentStyles w:defLockedState="0" w:defUIPriority="0" w:defSemiHidden="0" w:defUnhideWhenUsed="0" w:defQFormat="0" w:count="375">
+  <w:latentStyles w:defLockedState="0" w:defUIPriority="0" w:defSemiHidden="0" w:defUnhideWhenUsed="0" w:defQFormat="0" w:count="376">
     <w:lsdException w:name="Normal" w:qFormat="1"/>
     <w:lsdException w:name="heading 1" w:qFormat="1"/>
     <w:lsdException w:name="heading 2" w:qFormat="1"/>
@@ -3019,6 +3017,7 @@
     <w:lsdException w:name="Smart Hyperlink" w:semiHidden="1" w:uiPriority="99" w:unhideWhenUsed="1"/>
     <w:lsdException w:name="Hashtag" w:semiHidden="1" w:uiPriority="99" w:unhideWhenUsed="1"/>
     <w:lsdException w:name="Unresolved Mention" w:semiHidden="1" w:uiPriority="99" w:unhideWhenUsed="1"/>
+    <w:lsdException w:name="Smart Link" w:semiHidden="1" w:uiPriority="99" w:unhideWhenUsed="1"/>
   </w:latentStyles>
   <w:style w:type="paragraph" w:default="1" w:styleId="Standard">
     <w:name w:val="Normal"/>
@@ -4467,12 +4466,7 @@
 </file>
 
 <file path=customXml/item1.xml><?xml version="1.0" encoding="utf-8"?>
-<?mso-contentType ?>
-<FormTemplates xmlns="http://schemas.microsoft.com/sharepoint/v3/contenttype/forms">
-  <Display>DocumentLibraryForm</Display>
-  <Edit>DocumentLibraryForm</Edit>
-  <New>DocumentLibraryForm</New>
-</FormTemplates>
+<b:Sources xmlns:b="http://schemas.openxmlformats.org/officeDocument/2006/bibliography" xmlns="http://schemas.openxmlformats.org/officeDocument/2006/bibliography" SelectedStyle="\APASixthEditionOfficeOnline.xsl" StyleName="APA" Version="6"/>
 </file>
 
 <file path=customXml/item2.xml><?xml version="1.0" encoding="utf-8"?>
@@ -4697,7 +4691,12 @@
 </file>
 
 <file path=customXml/item3.xml><?xml version="1.0" encoding="utf-8"?>
-<b:Sources xmlns:b="http://schemas.openxmlformats.org/officeDocument/2006/bibliography" xmlns="http://schemas.openxmlformats.org/officeDocument/2006/bibliography" SelectedStyle="\APASixthEditionOfficeOnline.xsl" StyleName="APA" Version="6"/>
+<?mso-contentType ?>
+<FormTemplates xmlns="http://schemas.microsoft.com/sharepoint/v3/contenttype/forms">
+  <Display>DocumentLibraryForm</Display>
+  <Edit>DocumentLibraryForm</Edit>
+  <New>DocumentLibraryForm</New>
+</FormTemplates>
 </file>
 
 <file path=customXml/item4.xml><?xml version="1.0" encoding="utf-8"?>
@@ -4719,6 +4718,33 @@
 </file>
 
 <file path=customXml/itemProps1.xml><?xml version="1.0" encoding="utf-8"?>
+<ds:datastoreItem xmlns:ds="http://schemas.openxmlformats.org/officeDocument/2006/customXml" ds:itemID="{186699DF-3042-46B7-BF92-79FEE9A722E2}">
+  <ds:schemaRefs>
+    <ds:schemaRef ds:uri="http://schemas.openxmlformats.org/officeDocument/2006/bibliography"/>
+  </ds:schemaRefs>
+</ds:datastoreItem>
+</file>
+
+<file path=customXml/itemProps2.xml><?xml version="1.0" encoding="utf-8"?>
+<ds:datastoreItem xmlns:ds="http://schemas.openxmlformats.org/officeDocument/2006/customXml" ds:itemID="{5A1E84AE-9BC3-4141-BE80-6EDB216A766A}">
+  <ds:schemaRefs>
+    <ds:schemaRef ds:uri="http://schemas.microsoft.com/office/2006/metadata/contentType"/>
+    <ds:schemaRef ds:uri="http://schemas.microsoft.com/office/2006/metadata/properties/metaAttributes"/>
+    <ds:schemaRef ds:uri="http://www.w3.org/2001/XMLSchema"/>
+    <ds:schemaRef ds:uri="http://schemas.microsoft.com/office/2006/metadata/properties"/>
+    <ds:schemaRef ds:uri="781aea2d-10e0-4ee3-884b-add8d5bc0221"/>
+    <ds:schemaRef ds:uri="9d05811c-d03a-4781-95bb-5954497aed9b"/>
+    <ds:schemaRef ds:uri="http://schemas.microsoft.com/office/2006/documentManagement/types"/>
+    <ds:schemaRef ds:uri="http://schemas.microsoft.com/office/infopath/2007/PartnerControls"/>
+    <ds:schemaRef ds:uri="http://schemas.openxmlformats.org/package/2006/metadata/core-properties"/>
+    <ds:schemaRef ds:uri="http://purl.org/dc/elements/1.1/"/>
+    <ds:schemaRef ds:uri="http://purl.org/dc/terms/"/>
+    <ds:schemaRef ds:uri="http://schemas.microsoft.com/internal/obd"/>
+  </ds:schemaRefs>
+</ds:datastoreItem>
+</file>
+
+<file path=customXml/itemProps3.xml><?xml version="1.0" encoding="utf-8"?>
 <ds:datastoreItem xmlns:ds="http://schemas.openxmlformats.org/officeDocument/2006/customXml" ds:itemID="{3CFDF122-D7E9-4488-94E6-B763E0A75560}">
   <ds:schemaRefs>
     <ds:schemaRef ds:uri="http://schemas.microsoft.com/sharepoint/v3/contenttype/forms"/>
@@ -4726,18 +4752,13 @@
 </ds:datastoreItem>
 </file>
 
-<file path=customXml/itemProps2.xml><?xml version="1.0" encoding="utf-8"?>
-<ds:datastoreItem xmlns:ds="http://schemas.openxmlformats.org/officeDocument/2006/customXml" ds:itemID="{5A1E84AE-9BC3-4141-BE80-6EDB216A766A}"/>
-</file>
-
-<file path=customXml/itemProps3.xml><?xml version="1.0" encoding="utf-8"?>
-<ds:datastoreItem xmlns:ds="http://schemas.openxmlformats.org/officeDocument/2006/customXml" ds:itemID="{186699DF-3042-46B7-BF92-79FEE9A722E2}">
+<file path=customXml/itemProps4.xml><?xml version="1.0" encoding="utf-8"?>
+<ds:datastoreItem xmlns:ds="http://schemas.openxmlformats.org/officeDocument/2006/customXml" ds:itemID="{11ADDDBA-9102-452F-BE99-8A70886CA66B}">
   <ds:schemaRefs>
-    <ds:schemaRef ds:uri="http://schemas.openxmlformats.org/officeDocument/2006/bibliography"/>
+    <ds:schemaRef ds:uri="http://schemas.microsoft.com/office/2006/metadata/properties"/>
+    <ds:schemaRef ds:uri="http://schemas.microsoft.com/office/infopath/2007/PartnerControls"/>
+    <ds:schemaRef ds:uri="9d05811c-d03a-4781-95bb-5954497aed9b"/>
+    <ds:schemaRef ds:uri="781aea2d-10e0-4ee3-884b-add8d5bc0221"/>
   </ds:schemaRefs>
 </ds:datastoreItem>
-</file>
-
-<file path=customXml/itemProps4.xml><?xml version="1.0" encoding="utf-8"?>
-<ds:datastoreItem xmlns:ds="http://schemas.openxmlformats.org/officeDocument/2006/customXml" ds:itemID="{11ADDDBA-9102-452F-BE99-8A70886CA66B}"/>
 </file>
</xml_diff>